<commit_message>
Update Class 06 slides.
</commit_message>
<xml_diff>
--- a/class06w.docx
+++ b/class06w.docx
@@ -3735,7 +3735,7 @@
         </w:numPr>
       </w:pPr>
       <w:r>
-        <w:t xml:space="preserve">90% uncertainty interval with OLS/t test was (0.20, 0.47) and the bootstrap 90% uncertainty interval was also (0.20, 0.47).</w:t>
+        <w:t xml:space="preserve">90% uncertainty interval with OLS/t test was (0.20, 0.47) and the bootstrap 90% uncertainty interval was also (0.19, 0.47).</w:t>
       </w:r>
     </w:p>
     <w:bookmarkEnd w:id="38"/>
@@ -18081,7 +18081,7 @@
         <w:rPr>
           <w:rStyle w:val="VerbatimChar"/>
         </w:rPr>
-        <w:t xml:space="preserve">  pbkrtest_0.5.5         performance_0.15.1     pillar_1.11.0         </w:t>
+        <w:t xml:space="preserve">  pbkrtest_0.5.5         performance_0.15.1     pillar_1.11.1         </w:t>
       </w:r>
       <w:r>
         <w:br/>

</xml_diff>